<commit_message>
geaders && footer && function php && scss
</commit_message>
<xml_diff>
--- a/wp-content/themes/PLAI/assets/perssona/Persona Lucie Durant.docx
+++ b/wp-content/themes/PLAI/assets/perssona/Persona Lucie Durant.docx
@@ -256,7 +256,16 @@
           <w:lang w:eastAsia="fr-FR"/>
           <w14:ligatures w14:val="none"/>
         </w:rPr>
-        <w:t xml:space="preserve"> est une enseignante investie et expérimentée. Elle accueille dans sa classe plusieurs élèves à besoins spécifiques (troubles de l’apprentissage, TDAH, difficultés langagières). Elle souhaite proposer un accompagnement adapté, mais manque parfois de temps et de repères clairs pour mettre en place des aménagements efficaces.</w:t>
+        <w:t xml:space="preserve"> est une enseignante investie et expérimentée. Elle accueille dans sa classe plusieurs élèves à besoins spécifiques (troubles de l’apprentissage, TDAH, difficultés langagières). Elle souhaite proposer un accompagnement adapté, mais </w:t>
+      </w:r>
+      <w:r>
+        <w:rPr>
+          <w:rFonts w:ascii="Times New Roman" w:eastAsia="Times New Roman" w:hAnsi="Times New Roman" w:cs="Times New Roman"/>
+          <w:kern w:val="0"/>
+          <w:lang w:eastAsia="fr-FR"/>
+          <w14:ligatures w14:val="none"/>
+        </w:rPr>
+        <w:t>ne sait pas quel outil choisir en fonction du besoin et comment les trouver.</w:t>
       </w:r>
     </w:p>
     <w:p>
@@ -309,7 +318,16 @@
           <w:lang w:eastAsia="fr-FR"/>
           <w14:ligatures w14:val="none"/>
         </w:rPr>
-        <w:t>Comprendre rapidement les aménagements raisonnables possibles</w:t>
+        <w:t xml:space="preserve">Comprendre </w:t>
+      </w:r>
+      <w:r>
+        <w:rPr>
+          <w:rFonts w:ascii="Times New Roman" w:eastAsia="Times New Roman" w:hAnsi="Times New Roman" w:cs="Times New Roman"/>
+          <w:kern w:val="0"/>
+          <w:lang w:eastAsia="fr-FR"/>
+          <w14:ligatures w14:val="none"/>
+        </w:rPr>
+        <w:t>comment mettre en place une aide pour ces élèves</w:t>
       </w:r>
     </w:p>
     <w:p>
@@ -357,7 +375,16 @@
           <w:lang w:eastAsia="fr-FR"/>
           <w14:ligatures w14:val="none"/>
         </w:rPr>
-        <w:t>Consulter des documents officiels fiables</w:t>
+        <w:t>Tester des outils</w:t>
+      </w:r>
+      <w:r>
+        <w:rPr>
+          <w:rFonts w:ascii="Times New Roman" w:eastAsia="Times New Roman" w:hAnsi="Times New Roman" w:cs="Times New Roman"/>
+          <w:kern w:val="0"/>
+          <w:lang w:eastAsia="fr-FR"/>
+          <w14:ligatures w14:val="none"/>
+        </w:rPr>
+        <w:t xml:space="preserve"> fiables</w:t>
       </w:r>
     </w:p>
     <w:p>
@@ -405,7 +432,25 @@
           <w:lang w:eastAsia="fr-FR"/>
           <w14:ligatures w14:val="none"/>
         </w:rPr>
-        <w:t>Identifier les formations disponibles</w:t>
+        <w:t>Obtenir des informations sur d</w:t>
+      </w:r>
+      <w:r>
+        <w:rPr>
+          <w:rFonts w:ascii="Times New Roman" w:eastAsia="Times New Roman" w:hAnsi="Times New Roman" w:cs="Times New Roman"/>
+          <w:kern w:val="0"/>
+          <w:lang w:eastAsia="fr-FR"/>
+          <w14:ligatures w14:val="none"/>
+        </w:rPr>
+        <w:t xml:space="preserve">es formations </w:t>
+      </w:r>
+      <w:r>
+        <w:rPr>
+          <w:rFonts w:ascii="Times New Roman" w:eastAsia="Times New Roman" w:hAnsi="Times New Roman" w:cs="Times New Roman"/>
+          <w:kern w:val="0"/>
+          <w:lang w:eastAsia="fr-FR"/>
+          <w14:ligatures w14:val="none"/>
+        </w:rPr>
+        <w:t>possibles</w:t>
       </w:r>
     </w:p>
     <w:p>
@@ -482,16 +527,43 @@
           <w:lang w:eastAsia="fr-FR"/>
           <w14:ligatures w14:val="none"/>
         </w:rPr>
-        <w:t>Informations structurées et synthétiques</w:t>
-      </w:r>
-      <w:r>
-        <w:rPr>
-          <w:rFonts w:ascii="Times New Roman" w:eastAsia="Times New Roman" w:hAnsi="Times New Roman" w:cs="Times New Roman"/>
-          <w:kern w:val="0"/>
-          <w:lang w:eastAsia="fr-FR"/>
-          <w14:ligatures w14:val="none"/>
-        </w:rPr>
-        <w:t xml:space="preserve"> et présenté  par niveaux</w:t>
+        <w:t>Informations structurées</w:t>
+      </w:r>
+      <w:r>
+        <w:rPr>
+          <w:rFonts w:ascii="Times New Roman" w:eastAsia="Times New Roman" w:hAnsi="Times New Roman" w:cs="Times New Roman"/>
+          <w:kern w:val="0"/>
+          <w:lang w:eastAsia="fr-FR"/>
+          <w14:ligatures w14:val="none"/>
+        </w:rPr>
+        <w:t xml:space="preserve"> et présenté</w:t>
+      </w:r>
+      <w:r>
+        <w:rPr>
+          <w:rFonts w:ascii="Times New Roman" w:eastAsia="Times New Roman" w:hAnsi="Times New Roman" w:cs="Times New Roman"/>
+          <w:kern w:val="0"/>
+          <w:lang w:eastAsia="fr-FR"/>
+          <w14:ligatures w14:val="none"/>
+        </w:rPr>
+        <w:t>es</w:t>
+      </w:r>
+      <w:r>
+        <w:rPr>
+          <w:rFonts w:ascii="Times New Roman" w:eastAsia="Times New Roman" w:hAnsi="Times New Roman" w:cs="Times New Roman"/>
+          <w:kern w:val="0"/>
+          <w:lang w:eastAsia="fr-FR"/>
+          <w14:ligatures w14:val="none"/>
+        </w:rPr>
+        <w:t xml:space="preserve">  par </w:t>
+      </w:r>
+      <w:r>
+        <w:rPr>
+          <w:rFonts w:ascii="Times New Roman" w:eastAsia="Times New Roman" w:hAnsi="Times New Roman" w:cs="Times New Roman"/>
+          <w:kern w:val="0"/>
+          <w:lang w:eastAsia="fr-FR"/>
+          <w14:ligatures w14:val="none"/>
+        </w:rPr>
+        <w:t>matière</w:t>
       </w:r>
     </w:p>
     <w:p>
@@ -689,7 +761,34 @@
           <w:lang w:eastAsia="fr-FR"/>
           <w14:ligatures w14:val="none"/>
         </w:rPr>
-        <w:t>Trouver rapidement des solutions concrètes pour adapter son enseignement, gagner en autonomie et sécuriser ses pratiques dans le cadre institutionnel.</w:t>
+        <w:t xml:space="preserve">Trouver rapidement des solutions concrètes pour adapter son enseignement, </w:t>
+      </w:r>
+      <w:r>
+        <w:rPr>
+          <w:rFonts w:ascii="Times New Roman" w:eastAsia="Times New Roman" w:hAnsi="Times New Roman" w:cs="Times New Roman"/>
+          <w:kern w:val="0"/>
+          <w:lang w:eastAsia="fr-FR"/>
+          <w14:ligatures w14:val="none"/>
+        </w:rPr>
+        <w:t xml:space="preserve">trouver des aides à proposer à ces élèves,  accéder à des formations et </w:t>
+      </w:r>
+      <w:r>
+        <w:rPr>
+          <w:rFonts w:ascii="Times New Roman" w:eastAsia="Times New Roman" w:hAnsi="Times New Roman" w:cs="Times New Roman"/>
+          <w:kern w:val="0"/>
+          <w:lang w:eastAsia="fr-FR"/>
+          <w14:ligatures w14:val="none"/>
+        </w:rPr>
+        <w:t>gagner en autonomie</w:t>
+      </w:r>
+      <w:r>
+        <w:rPr>
+          <w:rFonts w:ascii="Times New Roman" w:eastAsia="Times New Roman" w:hAnsi="Times New Roman" w:cs="Times New Roman"/>
+          <w:kern w:val="0"/>
+          <w:lang w:eastAsia="fr-FR"/>
+          <w14:ligatures w14:val="none"/>
+        </w:rPr>
+        <w:t>.</w:t>
       </w:r>
     </w:p>
     <w:p>

</xml_diff>